<commit_message>
Add duplicate file detection in upload queue
- Create unique fingerprint per file (name + size + lastModified)
- Skip exact duplicates silently (same file added twice)
- Warn when adding same-named files with different content
- Helps prevent browser issues with same-named files from different folders
</commit_message>
<xml_diff>
--- a/static/templates/report_templates/timeline_new.docx
+++ b/static/templates/report_templates/timeline_new.docx
@@ -626,24 +626,6 @@
           <w:tab w:val="left" w:pos="620"/>
         </w:tabs>
       </w:pPr>
-      <w:r>
-        <w:br/>
-        <w:t xml:space="preserve">{{ </w:t>
-      </w:r>
-      <w:r>
-        <w:t xml:space="preserve">detailed_timeline </w:t>
-      </w:r>
-      <w:r>
-        <w:t xml:space="preserve"> }}</w:t>
-      </w:r>
-    </w:p>
-    <w:p>
-      <w:pPr>
-        <w:pStyle w:val="NoSpacing"/>
-        <w:tabs>
-          <w:tab w:val="left" w:pos="620"/>
-        </w:tabs>
-      </w:pPr>
     </w:p>
     <w:p>
       <w:pPr>
@@ -657,7 +639,7 @@
           <w:noProof/>
           <w14:ligatures w14:val="standardContextual"/>
         </w:rPr>
-        <w:pict w14:anchorId="0C333321">
+        <w:pict w14:anchorId="3F75BC49">
           <v:rect id="_x0000_i1026" alt="" style="width:468pt;height:1.2pt;mso-width-percent:0;mso-height-percent:0;mso-width-percent:0;mso-height-percent:0" o:hralign="center" o:hrstd="t" o:hr="t" fillcolor="#a0a0a0" stroked="f"/>
         </w:pict>
       </w:r>
@@ -669,6 +651,17 @@
           <w:tab w:val="left" w:pos="620"/>
         </w:tabs>
       </w:pPr>
+    </w:p>
+    <w:p>
+      <w:pPr>
+        <w:pStyle w:val="NoSpacing"/>
+        <w:tabs>
+          <w:tab w:val="left" w:pos="620"/>
+        </w:tabs>
+      </w:pPr>
+      <w:r>
+        <w:t>{{ detailed_timeline }}}</w:t>
+      </w:r>
     </w:p>
     <w:p>
       <w:pPr>
@@ -690,7 +683,7 @@
           <w:noProof/>
           <w14:ligatures w14:val="standardContextual"/>
         </w:rPr>
-        <w:pict w14:anchorId="3A6F19FF">
+        <w:pict w14:anchorId="11B06969">
           <v:rect id="_x0000_i1025" alt="" style="width:468pt;height:1.2pt;mso-width-percent:0;mso-height-percent:0;mso-width-percent:0;mso-height-percent:0" o:hralign="center" o:hrstd="t" o:hr="t" fillcolor="#a0a0a0" stroked="f"/>
         </w:pict>
       </w:r>
@@ -874,7 +867,7 @@
       <w:rPr>
         <w:noProof/>
       </w:rPr>
-      <w:pict w14:anchorId="119937BA">
+      <w:pict w14:anchorId="49742EAA">
         <v:shapetype id="_x0000_t75" coordsize="21600,21600" o:spt="75" o:preferrelative="t" path="m@4@5l@4@11@9@11@9@5xe" filled="f" stroked="f">
           <v:stroke joinstyle="miter"/>
           <v:formulas>
@@ -919,7 +912,7 @@
       <w:rPr>
         <w:noProof/>
       </w:rPr>
-      <w:pict w14:anchorId="4CDCB74F">
+      <w:pict w14:anchorId="38A75EE9">
         <v:shapetype id="_x0000_t75" coordsize="21600,21600" o:spt="75" o:preferrelative="t" path="m@4@5l@4@11@9@11@9@5xe" filled="f" stroked="f">
           <v:stroke joinstyle="miter"/>
           <v:formulas>

</xml_diff>